<commit_message>
DCVConditioning Schematic added and Schematic Sheet names changed
</commit_message>
<xml_diff>
--- a/Meeting_Minutes(TemporarilyHere)/Meeting Minutes 23.01.25.docx
+++ b/Meeting_Minutes(TemporarilyHere)/Meeting Minutes 23.01.25.docx
@@ -67,15 +67,6 @@
         <w:t>So just need to account for the external voltage input that is causing the bias</w:t>
       </w:r>
     </w:p>
-    <w:p/>
-    <w:p/>
-    <w:p/>
-    <w:p/>
-    <w:p>
-      <w:r>
-        <w:t>Things to do:</w:t>
-      </w:r>
-    </w:p>
     <w:p>
       <w:pPr>
         <w:pStyle w:val="ListParagraph"/>
@@ -85,7 +76,7 @@
         </w:numPr>
       </w:pPr>
       <w:r>
-        <w:t>Read about how bode plots are used in electrical engineering</w:t>
+        <w:t>When I am simulating the Overcurrent Detection LTspice model, I do the transient analysis with 0.1 sec stop time but the simulation is very slow – like it doesn’t end. I tried with lower stop times but it is the same</w:t>
       </w:r>
     </w:p>
     <w:p>
@@ -97,7 +88,113 @@
         </w:numPr>
       </w:pPr>
       <w:r>
+        <w:t>Oh if I go down to 1 nano second it is alright</w:t>
+      </w:r>
+    </w:p>
+    <w:p>
+      <w:pPr>
+        <w:pStyle w:val="ListParagraph"/>
+        <w:numPr>
+          <w:ilvl w:val="1"/>
+          <w:numId w:val="1"/>
+        </w:numPr>
+      </w:pPr>
+      <w:r>
+        <w:t>I think the step sizes are just different</w:t>
+      </w:r>
+    </w:p>
+    <w:p/>
+    <w:p/>
+    <w:p/>
+    <w:p/>
+    <w:p>
+      <w:r>
+        <w:t>Things to do:</w:t>
+      </w:r>
+    </w:p>
+    <w:p>
+      <w:pPr>
+        <w:pStyle w:val="ListParagraph"/>
+        <w:numPr>
+          <w:ilvl w:val="0"/>
+          <w:numId w:val="1"/>
+        </w:numPr>
+      </w:pPr>
+      <w:r>
+        <w:t>Read about how bode plots are used in electrical engineering</w:t>
+      </w:r>
+    </w:p>
+    <w:p>
+      <w:pPr>
+        <w:pStyle w:val="ListParagraph"/>
+        <w:numPr>
+          <w:ilvl w:val="1"/>
+          <w:numId w:val="1"/>
+        </w:numPr>
+      </w:pPr>
+      <w:r>
         <w:t>And signal processing</w:t>
+      </w:r>
+    </w:p>
+    <w:p/>
+    <w:p/>
+    <w:p>
+      <w:r>
+        <w:t>Components that pull current on Interface:</w:t>
+      </w:r>
+    </w:p>
+    <w:p>
+      <w:pPr>
+        <w:pStyle w:val="ListParagraph"/>
+        <w:numPr>
+          <w:ilvl w:val="0"/>
+          <w:numId w:val="1"/>
+        </w:numPr>
+      </w:pPr>
+      <w:r>
+        <w:t xml:space="preserve">2x </w:t>
+      </w:r>
+      <w:r>
+        <w:t>SN74HCS08DR</w:t>
+      </w:r>
+      <w:r>
+        <w:t xml:space="preserve"> AND Gate for Overcurrent Detection (3.3V)</w:t>
+      </w:r>
+    </w:p>
+    <w:p>
+      <w:pPr>
+        <w:pStyle w:val="ListParagraph"/>
+        <w:numPr>
+          <w:ilvl w:val="1"/>
+          <w:numId w:val="1"/>
+        </w:numPr>
+      </w:pPr>
+      <w:r>
+        <w:t>Can use LTspice models to estimate current pull</w:t>
+      </w:r>
+    </w:p>
+    <w:p>
+      <w:pPr>
+        <w:pStyle w:val="ListParagraph"/>
+        <w:numPr>
+          <w:ilvl w:val="1"/>
+          <w:numId w:val="1"/>
+        </w:numPr>
+      </w:pPr>
+      <w:r>
+        <w:t>For quiescent current consult the Datasheet</w:t>
+      </w:r>
+    </w:p>
+    <w:p>
+      <w:pPr>
+        <w:pStyle w:val="ListParagraph"/>
+        <w:numPr>
+          <w:ilvl w:val="0"/>
+          <w:numId w:val="1"/>
+        </w:numPr>
+      </w:pPr>
+      <w:r>
+        <w:t>3x Fully differential signals for Analog current measurement signals</w:t>
       </w:r>
     </w:p>
     <w:sectPr>

</xml_diff>

<commit_message>
small changes to schematic & excel with current pull of all components
</commit_message>
<xml_diff>
--- a/Meeting_Minutes(TemporarilyHere)/Meeting Minutes 23.01.25.docx
+++ b/Meeting_Minutes(TemporarilyHere)/Meeting Minutes 23.01.25.docx
@@ -4,7 +4,15 @@
   <w:body>
     <w:p>
       <w:r>
-        <w:t>Questions for Eyke:</w:t>
+        <w:t xml:space="preserve">Questions for </w:t>
+      </w:r>
+      <w:proofErr w:type="spellStart"/>
+      <w:r>
+        <w:t>Eyke</w:t>
+      </w:r>
+      <w:proofErr w:type="spellEnd"/>
+      <w:r>
+        <w:t>:</w:t>
       </w:r>
     </w:p>
     <w:p>
@@ -76,7 +84,15 @@
         </w:numPr>
       </w:pPr>
       <w:r>
-        <w:t>When I am simulating the Overcurrent Detection LTspice model, I do the transient analysis with 0.1 sec stop time but the simulation is very slow – like it doesn’t end. I tried with lower stop times but it is the same</w:t>
+        <w:t xml:space="preserve">When I am simulating the Overcurrent Detection </w:t>
+      </w:r>
+      <w:proofErr w:type="spellStart"/>
+      <w:r>
+        <w:t>LTspice</w:t>
+      </w:r>
+      <w:proofErr w:type="spellEnd"/>
+      <w:r>
+        <w:t xml:space="preserve"> model, I do the transient analysis with 0.1 sec stop time but the simulation is very slow – like it doesn’t end. I tried with lower stop times but it is the same</w:t>
       </w:r>
     </w:p>
     <w:p>
@@ -103,15 +119,6 @@
         <w:t>I think the step sizes are just different</w:t>
       </w:r>
     </w:p>
-    <w:p/>
-    <w:p/>
-    <w:p/>
-    <w:p/>
-    <w:p>
-      <w:r>
-        <w:t>Things to do:</w:t>
-      </w:r>
-    </w:p>
     <w:p>
       <w:pPr>
         <w:pStyle w:val="ListParagraph"/>
@@ -120,8 +127,13 @@
           <w:numId w:val="1"/>
         </w:numPr>
       </w:pPr>
-      <w:r>
-        <w:t>Read about how bode plots are used in electrical engineering</w:t>
+      <w:proofErr w:type="spellStart"/>
+      <w:r>
+        <w:t>LTspice</w:t>
+      </w:r>
+      <w:proofErr w:type="spellEnd"/>
+      <w:r>
+        <w:t xml:space="preserve"> to get current values</w:t>
       </w:r>
     </w:p>
     <w:p>
@@ -133,14 +145,160 @@
         </w:numPr>
       </w:pPr>
       <w:r>
-        <w:t>And signal processing</w:t>
+        <w:t xml:space="preserve">If I add all the current values for VCC, VOCM and </w:t>
+      </w:r>
+      <w:proofErr w:type="spellStart"/>
+      <w:r>
+        <w:t>V_bias</w:t>
+      </w:r>
+      <w:proofErr w:type="spellEnd"/>
+      <w:r>
+        <w:t xml:space="preserve"> am I not theoretically adding the </w:t>
+      </w:r>
+      <w:proofErr w:type="spellStart"/>
+      <w:r>
+        <w:t>quidiscent</w:t>
+      </w:r>
+      <w:proofErr w:type="spellEnd"/>
+      <w:r>
+        <w:t xml:space="preserve"> current multiple times?</w:t>
+      </w:r>
+    </w:p>
+    <w:p>
+      <w:pPr>
+        <w:pStyle w:val="ListParagraph"/>
+        <w:numPr>
+          <w:ilvl w:val="2"/>
+          <w:numId w:val="1"/>
+        </w:numPr>
+      </w:pPr>
+      <w:r>
+        <w:t xml:space="preserve">I mean the current that VOCM pulls is lower than the </w:t>
+      </w:r>
+      <w:proofErr w:type="spellStart"/>
+      <w:r>
+        <w:t>quidiscent</w:t>
+      </w:r>
+      <w:proofErr w:type="spellEnd"/>
+      <w:r>
+        <w:t xml:space="preserve"> current</w:t>
+      </w:r>
+    </w:p>
+    <w:p>
+      <w:r>
+        <w:drawing>
+          <wp:inline distT="0" distB="0" distL="0" distR="0" wp14:anchorId="3DEE5C8C" wp14:editId="21006BE7">
+            <wp:extent cx="4616450" cy="2292370"/>
+            <wp:effectExtent l="0" t="0" r="0" b="0"/>
+            <wp:docPr id="637990122" name="Picture 1" descr="A screenshot of a computer&#10;&#10;Description automatically generated"/>
+            <wp:cNvGraphicFramePr>
+              <a:graphicFrameLocks xmlns:a="http://schemas.openxmlformats.org/drawingml/2006/main" noChangeAspect="1"/>
+            </wp:cNvGraphicFramePr>
+            <a:graphic xmlns:a="http://schemas.openxmlformats.org/drawingml/2006/main">
+              <a:graphicData uri="http://schemas.openxmlformats.org/drawingml/2006/picture">
+                <pic:pic xmlns:pic="http://schemas.openxmlformats.org/drawingml/2006/picture">
+                  <pic:nvPicPr>
+                    <pic:cNvPr id="637990122" name="Picture 1" descr="A screenshot of a computer&#10;&#10;Description automatically generated"/>
+                    <pic:cNvPicPr/>
+                  </pic:nvPicPr>
+                  <pic:blipFill>
+                    <a:blip r:embed="rId5"/>
+                    <a:stretch>
+                      <a:fillRect/>
+                    </a:stretch>
+                  </pic:blipFill>
+                  <pic:spPr>
+                    <a:xfrm>
+                      <a:off x="0" y="0"/>
+                      <a:ext cx="4623686" cy="2295963"/>
+                    </a:xfrm>
+                    <a:prstGeom prst="rect">
+                      <a:avLst/>
+                    </a:prstGeom>
+                  </pic:spPr>
+                </pic:pic>
+              </a:graphicData>
+            </a:graphic>
+          </wp:inline>
+        </w:drawing>
+      </w:r>
+    </w:p>
+    <w:p/>
+    <w:p>
+      <w:r>
+        <w:rPr>
+          <w:highlight w:val="yellow"/>
+        </w:rPr>
+        <w:t>Just realized that different receiver models are being used is this okay?</w:t>
+      </w:r>
+    </w:p>
+    <w:p>
+      <w:pPr>
+        <w:rPr>
+          <w:b/>
+          <w:bCs/>
+        </w:rPr>
+      </w:pPr>
+      <w:r>
+        <w:t>HFBR-2528Z</w:t>
+      </w:r>
+      <w:r>
+        <w:t xml:space="preserve"> – receiver when on the website it states </w:t>
+      </w:r>
+      <w:r>
+        <w:rPr>
+          <w:b/>
+          <w:bCs/>
+        </w:rPr>
+        <w:t>Broadcom HFBR-2521Z</w:t>
+      </w:r>
+    </w:p>
+    <w:p>
+      <w:pPr>
+        <w:rPr>
+          <w:b/>
+          <w:bCs/>
+        </w:rPr>
+      </w:pPr>
+      <w:r>
+        <w:t>HFBR-1521Z</w:t>
+      </w:r>
+      <w:r>
+        <w:t xml:space="preserve"> – transmitter when on the website it states </w:t>
+      </w:r>
+      <w:r>
+        <w:rPr>
+          <w:b/>
+          <w:bCs/>
+        </w:rPr>
+        <w:t>Broadcom HFBR-1521Z</w:t>
+      </w:r>
+    </w:p>
+    <w:p>
+      <w:pPr>
+        <w:rPr>
+          <w:b/>
+          <w:bCs/>
+        </w:rPr>
+      </w:pPr>
+    </w:p>
+    <w:p>
+      <w:r>
+        <w:rPr>
+          <w:b/>
+          <w:bCs/>
+        </w:rPr>
+        <w:t>Transmitters and Receivers have multiple 3.3V inputs. How would I estimate the current pull of the ones directly attached to circuit?</w:t>
       </w:r>
     </w:p>
     <w:p/>
     <w:p/>
-    <w:p>
-      <w:r>
-        <w:t>Components that pull current on Interface:</w:t>
+    <w:p/>
+    <w:p/>
+    <w:p/>
+    <w:p>
+      <w:r>
+        <w:t>Things to do:</w:t>
       </w:r>
     </w:p>
     <w:p>
@@ -152,13 +310,7 @@
         </w:numPr>
       </w:pPr>
       <w:r>
-        <w:t xml:space="preserve">2x </w:t>
-      </w:r>
-      <w:r>
-        <w:t>SN74HCS08DR</w:t>
-      </w:r>
-      <w:r>
-        <w:t xml:space="preserve"> AND Gate for Overcurrent Detection (3.3V)</w:t>
+        <w:t>Read about how bode plots are used in electrical engineering</w:t>
       </w:r>
     </w:p>
     <w:p>
@@ -170,7 +322,52 @@
         </w:numPr>
       </w:pPr>
       <w:r>
-        <w:t>Can use LTspice models to estimate current pull</w:t>
+        <w:t>And signal processing</w:t>
+      </w:r>
+    </w:p>
+    <w:p/>
+    <w:p/>
+    <w:p>
+      <w:r>
+        <w:t>Components that pull current on Interface:</w:t>
+      </w:r>
+    </w:p>
+    <w:p>
+      <w:pPr>
+        <w:pStyle w:val="ListParagraph"/>
+        <w:numPr>
+          <w:ilvl w:val="0"/>
+          <w:numId w:val="1"/>
+        </w:numPr>
+      </w:pPr>
+      <w:r>
+        <w:t xml:space="preserve">2x </w:t>
+      </w:r>
+      <w:r>
+        <w:t>SN74HCS08DR</w:t>
+      </w:r>
+      <w:r>
+        <w:t xml:space="preserve"> AND Gate for Overcurrent Detection (3.3V)</w:t>
+      </w:r>
+    </w:p>
+    <w:p>
+      <w:pPr>
+        <w:pStyle w:val="ListParagraph"/>
+        <w:numPr>
+          <w:ilvl w:val="1"/>
+          <w:numId w:val="1"/>
+        </w:numPr>
+      </w:pPr>
+      <w:r>
+        <w:t xml:space="preserve">Can use </w:t>
+      </w:r>
+      <w:proofErr w:type="spellStart"/>
+      <w:r>
+        <w:t>LTspice</w:t>
+      </w:r>
+      <w:proofErr w:type="spellEnd"/>
+      <w:r>
+        <w:t xml:space="preserve"> models to estimate current pull</w:t>
       </w:r>
     </w:p>
     <w:p>
@@ -931,7 +1128,6 @@
   <w:style w:type="character" w:default="1" w:styleId="DefaultParagraphFont">
     <w:name w:val="Default Paragraph Font"/>
     <w:uiPriority w:val="1"/>
-    <w:semiHidden/>
     <w:unhideWhenUsed/>
   </w:style>
   <w:style w:type="table" w:default="1" w:styleId="TableNormal">

</xml_diff>

<commit_message>
Power Schematic of pcb interface (work in progress)
</commit_message>
<xml_diff>
--- a/Meeting_Minutes(TemporarilyHere)/Meeting Minutes 23.01.25.docx
+++ b/Meeting_Minutes(TemporarilyHere)/Meeting Minutes 23.01.25.docx
@@ -186,6 +186,9 @@
     </w:p>
     <w:p>
       <w:r>
+        <w:rPr>
+          <w:noProof/>
+        </w:rPr>
         <w:drawing>
           <wp:inline distT="0" distB="0" distL="0" distR="0" wp14:anchorId="3DEE5C8C" wp14:editId="21006BE7">
             <wp:extent cx="4616450" cy="2292370"/>
@@ -283,6 +286,12 @@
       </w:pPr>
     </w:p>
     <w:p>
+      <w:pPr>
+        <w:rPr>
+          <w:b/>
+          <w:bCs/>
+        </w:rPr>
+      </w:pPr>
       <w:r>
         <w:rPr>
           <w:b/>
@@ -290,6 +299,141 @@
         </w:rPr>
         <w:t>Transmitters and Receivers have multiple 3.3V inputs. How would I estimate the current pull of the ones directly attached to circuit?</w:t>
       </w:r>
+    </w:p>
+    <w:p>
+      <w:pPr>
+        <w:rPr>
+          <w:b/>
+          <w:bCs/>
+        </w:rPr>
+      </w:pPr>
+    </w:p>
+    <w:p>
+      <w:pPr>
+        <w:rPr>
+          <w:b/>
+          <w:bCs/>
+        </w:rPr>
+      </w:pPr>
+    </w:p>
+    <w:p>
+      <w:pPr>
+        <w:pStyle w:val="ListParagraph"/>
+        <w:numPr>
+          <w:ilvl w:val="0"/>
+          <w:numId w:val="1"/>
+        </w:numPr>
+      </w:pPr>
+      <w:r>
+        <w:lastRenderedPageBreak/>
+        <w:t>Determining correct Bias voltage of circuit</w:t>
+      </w:r>
+    </w:p>
+    <w:p>
+      <w:pPr>
+        <w:pStyle w:val="ListParagraph"/>
+        <w:numPr>
+          <w:ilvl w:val="0"/>
+          <w:numId w:val="1"/>
+        </w:numPr>
+      </w:pPr>
+      <w:r>
+        <w:t>Differential Op Amp Feedback – especially when one end is connected to GND</w:t>
+      </w:r>
+    </w:p>
+    <w:p>
+      <w:pPr>
+        <w:pStyle w:val="ListParagraph"/>
+        <w:numPr>
+          <w:ilvl w:val="0"/>
+          <w:numId w:val="1"/>
+        </w:numPr>
+      </w:pPr>
+      <w:r>
+        <w:t>For 3.3V linear regulator there are 2 different models, which one should I use?</w:t>
+      </w:r>
+    </w:p>
+    <w:p>
+      <w:r>
+        <w:drawing>
+          <wp:anchor distT="0" distB="0" distL="114300" distR="114300" simplePos="0" relativeHeight="251658240" behindDoc="1" locked="0" layoutInCell="1" allowOverlap="1" wp14:anchorId="749A6D60" wp14:editId="42ACD949">
+            <wp:simplePos x="0" y="0"/>
+            <wp:positionH relativeFrom="column">
+              <wp:posOffset>0</wp:posOffset>
+            </wp:positionH>
+            <wp:positionV relativeFrom="paragraph">
+              <wp:posOffset>635</wp:posOffset>
+            </wp:positionV>
+            <wp:extent cx="1263650" cy="704616"/>
+            <wp:effectExtent l="0" t="0" r="0" b="635"/>
+            <wp:wrapTight wrapText="bothSides">
+              <wp:wrapPolygon edited="0">
+                <wp:start x="0" y="0"/>
+                <wp:lineTo x="0" y="21035"/>
+                <wp:lineTo x="21166" y="21035"/>
+                <wp:lineTo x="21166" y="0"/>
+                <wp:lineTo x="0" y="0"/>
+              </wp:wrapPolygon>
+            </wp:wrapTight>
+            <wp:docPr id="1254805273" name="Picture 1" descr="A screenshot of a computer&#10;&#10;Description automatically generated"/>
+            <wp:cNvGraphicFramePr>
+              <a:graphicFrameLocks xmlns:a="http://schemas.openxmlformats.org/drawingml/2006/main" noChangeAspect="1"/>
+            </wp:cNvGraphicFramePr>
+            <a:graphic xmlns:a="http://schemas.openxmlformats.org/drawingml/2006/main">
+              <a:graphicData uri="http://schemas.openxmlformats.org/drawingml/2006/picture">
+                <pic:pic xmlns:pic="http://schemas.openxmlformats.org/drawingml/2006/picture">
+                  <pic:nvPicPr>
+                    <pic:cNvPr id="1254805273" name="Picture 1" descr="A screenshot of a computer&#10;&#10;Description automatically generated"/>
+                    <pic:cNvPicPr/>
+                  </pic:nvPicPr>
+                  <pic:blipFill>
+                    <a:blip r:embed="rId6">
+                      <a:extLst>
+                        <a:ext uri="{28A0092B-C50C-407E-A947-70E740481C1C}">
+                          <a14:useLocalDpi xmlns:a14="http://schemas.microsoft.com/office/drawing/2010/main" val="0"/>
+                        </a:ext>
+                      </a:extLst>
+                    </a:blip>
+                    <a:stretch>
+                      <a:fillRect/>
+                    </a:stretch>
+                  </pic:blipFill>
+                  <pic:spPr>
+                    <a:xfrm>
+                      <a:off x="0" y="0"/>
+                      <a:ext cx="1263650" cy="704616"/>
+                    </a:xfrm>
+                    <a:prstGeom prst="rect">
+                      <a:avLst/>
+                    </a:prstGeom>
+                  </pic:spPr>
+                </pic:pic>
+              </a:graphicData>
+            </a:graphic>
+          </wp:anchor>
+        </w:drawing>
+      </w:r>
+      <w:r>
+        <w:t xml:space="preserve">Heat Sink </w:t>
+      </w:r>
+    </w:p>
+    <w:p>
+      <w:pPr>
+        <w:pStyle w:val="ListParagraph"/>
+        <w:numPr>
+          <w:ilvl w:val="0"/>
+          <w:numId w:val="1"/>
+        </w:numPr>
+      </w:pPr>
+    </w:p>
+    <w:p>
+      <w:pPr>
+        <w:pStyle w:val="ListParagraph"/>
+        <w:numPr>
+          <w:ilvl w:val="0"/>
+          <w:numId w:val="1"/>
+        </w:numPr>
+      </w:pPr>
     </w:p>
     <w:p/>
     <w:p/>
@@ -1128,6 +1272,7 @@
   <w:style w:type="character" w:default="1" w:styleId="DefaultParagraphFont">
     <w:name w:val="Default Paragraph Font"/>
     <w:uiPriority w:val="1"/>
+    <w:semiHidden/>
     <w:unhideWhenUsed/>
   </w:style>
   <w:style w:type="table" w:default="1" w:styleId="TableNormal">

</xml_diff>

<commit_message>
Schematic & LTspice changes - changes made recorded in onenote
</commit_message>
<xml_diff>
--- a/Meeting_Minutes(TemporarilyHere)/Meeting Minutes 23.01.25.docx
+++ b/Meeting_Minutes(TemporarilyHere)/Meeting Minutes 23.01.25.docx
@@ -3,16 +3,18 @@
 <w:document xmlns:wpc="http://schemas.microsoft.com/office/word/2010/wordprocessingCanvas" xmlns:cx="http://schemas.microsoft.com/office/drawing/2014/chartex" xmlns:cx1="http://schemas.microsoft.com/office/drawing/2015/9/8/chartex" xmlns:cx2="http://schemas.microsoft.com/office/drawing/2015/10/21/chartex" xmlns:cx3="http://schemas.microsoft.com/office/drawing/2016/5/9/chartex" xmlns:cx4="http://schemas.microsoft.com/office/drawing/2016/5/10/chartex" xmlns:cx5="http://schemas.microsoft.com/office/drawing/2016/5/11/chartex" xmlns:cx6="http://schemas.microsoft.com/office/drawing/2016/5/12/chartex" xmlns:cx7="http://schemas.microsoft.com/office/drawing/2016/5/13/chartex" xmlns:cx8="http://schemas.microsoft.com/office/drawing/2016/5/14/chartex" xmlns:mc="http://schemas.openxmlformats.org/markup-compatibility/2006" xmlns:aink="http://schemas.microsoft.com/office/drawing/2016/ink" xmlns:am3d="http://schemas.microsoft.com/office/drawing/2017/model3d" xmlns:o="urn:schemas-microsoft-com:office:office" xmlns:oel="http://schemas.microsoft.com/office/2019/extlst" xmlns:r="http://schemas.openxmlformats.org/officeDocument/2006/relationships" xmlns:m="http://schemas.openxmlformats.org/officeDocument/2006/math" xmlns:v="urn:schemas-microsoft-com:vml" xmlns:wp14="http://schemas.microsoft.com/office/word/2010/wordprocessingDrawing" xmlns:wp="http://schemas.openxmlformats.org/drawingml/2006/wordprocessingDrawing" xmlns:w10="urn:schemas-microsoft-com:office:word" xmlns:w="http://schemas.openxmlformats.org/wordprocessingml/2006/main" xmlns:w14="http://schemas.microsoft.com/office/word/2010/wordml" xmlns:w15="http://schemas.microsoft.com/office/word/2012/wordml" xmlns:w16cex="http://schemas.microsoft.com/office/word/2018/wordml/cex" xmlns:w16cid="http://schemas.microsoft.com/office/word/2016/wordml/cid" xmlns:w16="http://schemas.microsoft.com/office/word/2018/wordml" xmlns:w16du="http://schemas.microsoft.com/office/word/2023/wordml/word16du" xmlns:w16sdtdh="http://schemas.microsoft.com/office/word/2020/wordml/sdtdatahash" xmlns:w16sdtfl="http://schemas.microsoft.com/office/word/2024/wordml/sdtformatlock" xmlns:w16se="http://schemas.microsoft.com/office/word/2015/wordml/symex" xmlns:wpg="http://schemas.microsoft.com/office/word/2010/wordprocessingGroup" xmlns:wpi="http://schemas.microsoft.com/office/word/2010/wordprocessingInk" xmlns:wne="http://schemas.microsoft.com/office/word/2006/wordml" xmlns:wps="http://schemas.microsoft.com/office/word/2010/wordprocessingShape" mc:Ignorable="w14 w15 w16se w16cid w16 w16cex w16sdtdh w16sdtfl w16du wp14">
   <w:body>
     <w:p>
-      <w:r>
-        <w:t xml:space="preserve">Questions for </w:t>
-      </w:r>
-      <w:proofErr w:type="spellStart"/>
-      <w:r>
-        <w:t>Eyke</w:t>
-      </w:r>
-      <w:proofErr w:type="spellEnd"/>
-      <w:r>
-        <w:t>:</w:t>
+      <w:pPr>
+        <w:rPr>
+          <w:b/>
+          <w:bCs/>
+        </w:rPr>
+      </w:pPr>
+      <w:r>
+        <w:rPr>
+          <w:b/>
+          <w:bCs/>
+        </w:rPr>
+        <w:t>Agenda:</w:t>
       </w:r>
     </w:p>
     <w:p>
@@ -20,11 +22,11 @@
         <w:pStyle w:val="ListParagraph"/>
         <w:numPr>
           <w:ilvl w:val="0"/>
-          <w:numId w:val="1"/>
-        </w:numPr>
-      </w:pPr>
-      <w:r>
-        <w:t>If we have an unbiased signal that goes into a component that has GND-3.3V Rails, does that mean the output signal from this component is biased?</w:t>
+          <w:numId w:val="2"/>
+        </w:numPr>
+      </w:pPr>
+      <w:r>
+        <w:t>Bias Voltage Level</w:t>
       </w:r>
     </w:p>
     <w:p>
@@ -32,11 +34,24 @@
         <w:pStyle w:val="ListParagraph"/>
         <w:numPr>
           <w:ilvl w:val="1"/>
-          <w:numId w:val="1"/>
-        </w:numPr>
-      </w:pPr>
-      <w:r>
-        <w:t>By 3.3V/2 = 1.65V?</w:t>
+          <w:numId w:val="2"/>
+        </w:numPr>
+      </w:pPr>
+      <w:r>
+        <w:t>I calculated it to be around 1.68V but using the LTspice simulation the differential waves looked the best at 1.7V</w:t>
+      </w:r>
+    </w:p>
+    <w:p/>
+    <w:p>
+      <w:pPr>
+        <w:pStyle w:val="ListParagraph"/>
+        <w:numPr>
+          <w:ilvl w:val="0"/>
+          <w:numId w:val="2"/>
+        </w:numPr>
+      </w:pPr>
+      <w:r>
+        <w:t>Power Schematic</w:t>
       </w:r>
     </w:p>
     <w:p>
@@ -44,11 +59,11 @@
         <w:pStyle w:val="ListParagraph"/>
         <w:numPr>
           <w:ilvl w:val="1"/>
-          <w:numId w:val="1"/>
-        </w:numPr>
-      </w:pPr>
-      <w:r>
-        <w:t>Doesn’t that mean also for the VDC Conditioning, we have to account for the bias 1.65V?</w:t>
+          <w:numId w:val="2"/>
+        </w:numPr>
+      </w:pPr>
+      <w:r>
+        <w:t>Excel with all the Current pull from the different components</w:t>
       </w:r>
     </w:p>
     <w:p>
@@ -56,11 +71,23 @@
         <w:pStyle w:val="ListParagraph"/>
         <w:numPr>
           <w:ilvl w:val="2"/>
-          <w:numId w:val="1"/>
-        </w:numPr>
-      </w:pPr>
-      <w:r>
-        <w:t>No because the AD8615 is only acting as a voltage follower for signal conditioning. As the previously biased input is within the supply voltage rail of the op-amp, there is no problem with this op amp and no additional bias added to the signal</w:t>
+          <w:numId w:val="2"/>
+        </w:numPr>
+      </w:pPr>
+      <w:r>
+        <w:t>5V, 2.5V, 1.65V -&gt; LTspice simulations</w:t>
+      </w:r>
+    </w:p>
+    <w:p>
+      <w:pPr>
+        <w:pStyle w:val="ListParagraph"/>
+        <w:numPr>
+          <w:ilvl w:val="3"/>
+          <w:numId w:val="2"/>
+        </w:numPr>
+      </w:pPr>
+      <w:r>
+        <w:t>I assumed that the quiescent current is included in these values</w:t>
       </w:r>
     </w:p>
     <w:p>
@@ -68,31 +95,230 @@
         <w:pStyle w:val="ListParagraph"/>
         <w:numPr>
           <w:ilvl w:val="2"/>
-          <w:numId w:val="1"/>
-        </w:numPr>
-      </w:pPr>
-      <w:r>
-        <w:t>So just need to account for the external voltage input that is causing the bias</w:t>
-      </w:r>
-    </w:p>
+          <w:numId w:val="2"/>
+        </w:numPr>
+      </w:pPr>
+      <w:r>
+        <w:t>For Optical Receiver/Transmitter/Dual Inverter circuits took the max currents specified on the data sheets</w:t>
+      </w:r>
+    </w:p>
+    <w:p>
+      <w:pPr>
+        <w:pStyle w:val="ListParagraph"/>
+        <w:numPr>
+          <w:ilvl w:val="2"/>
+          <w:numId w:val="2"/>
+        </w:numPr>
+      </w:pPr>
+      <w:r>
+        <w:t>Transmitter: No direct voltage supply</w:t>
+      </w:r>
+    </w:p>
+    <w:p>
+      <w:pPr>
+        <w:pStyle w:val="ListParagraph"/>
+        <w:numPr>
+          <w:ilvl w:val="3"/>
+          <w:numId w:val="2"/>
+        </w:numPr>
+      </w:pPr>
+      <w:r>
+        <w:t>max. 80mA (continuous forward current I_Fdc)</w:t>
+      </w:r>
+    </w:p>
+    <w:p>
+      <w:pPr>
+        <w:pStyle w:val="ListParagraph"/>
+        <w:numPr>
+          <w:ilvl w:val="2"/>
+          <w:numId w:val="2"/>
+        </w:numPr>
+      </w:pPr>
+      <w:r>
+        <w:t xml:space="preserve">Receiver: </w:t>
+      </w:r>
+      <w:r>
+        <w:t>High Level Supply Current: max 6.3mA at 5.25Vcc</w:t>
+      </w:r>
+    </w:p>
+    <w:p>
+      <w:pPr>
+        <w:pStyle w:val="ListParagraph"/>
+        <w:numPr>
+          <w:ilvl w:val="2"/>
+          <w:numId w:val="2"/>
+        </w:numPr>
+      </w:pPr>
+      <w:r>
+        <w:t>Dual Inverter</w:t>
+      </w:r>
+    </w:p>
+    <w:p>
+      <w:pPr>
+        <w:pStyle w:val="ListParagraph"/>
+        <w:numPr>
+          <w:ilvl w:val="3"/>
+          <w:numId w:val="2"/>
+        </w:numPr>
+      </w:pPr>
+      <w:r>
+        <w:t>I_cc max 10 uA</w:t>
+      </w:r>
+    </w:p>
+    <w:p>
+      <w:pPr>
+        <w:pStyle w:val="ListParagraph"/>
+        <w:numPr>
+          <w:ilvl w:val="1"/>
+          <w:numId w:val="2"/>
+        </w:numPr>
+      </w:pPr>
+      <w:r>
+        <w:t xml:space="preserve">Using the TSP731 LDO for 2.5V and </w:t>
+      </w:r>
+      <w:r>
+        <w:t>1</w:t>
+      </w:r>
+      <w:r>
+        <w:t>.7V</w:t>
+      </w:r>
+    </w:p>
+    <w:p>
+      <w:pPr>
+        <w:pStyle w:val="ListParagraph"/>
+        <w:numPr>
+          <w:ilvl w:val="2"/>
+          <w:numId w:val="2"/>
+        </w:numPr>
+      </w:pPr>
+      <w:r>
+        <w:t>Feedback requires weird resistor combinations</w:t>
+      </w:r>
+    </w:p>
+    <w:p>
+      <w:pPr>
+        <w:pStyle w:val="ListParagraph"/>
+        <w:numPr>
+          <w:ilvl w:val="3"/>
+          <w:numId w:val="2"/>
+        </w:numPr>
+      </w:pPr>
+      <w:r>
+        <w:t>Not in ultrazohm library</w:t>
+      </w:r>
+    </w:p>
+    <w:p>
+      <w:pPr>
+        <w:pStyle w:val="ListParagraph"/>
+        <w:numPr>
+          <w:ilvl w:val="1"/>
+          <w:numId w:val="2"/>
+        </w:numPr>
+      </w:pPr>
+      <w:r>
+        <w:t>3.3V LDO – max 300mA output need</w:t>
+      </w:r>
+      <w:r>
+        <w:t>ed?</w:t>
+      </w:r>
+    </w:p>
+    <w:p>
+      <w:pPr>
+        <w:pStyle w:val="ListParagraph"/>
+        <w:numPr>
+          <w:ilvl w:val="2"/>
+          <w:numId w:val="2"/>
+        </w:numPr>
+      </w:pPr>
+      <w:hyperlink r:id="rId7" w:history="1">
+        <w:r>
+          <w:rPr>
+            <w:rStyle w:val="Hyperlink"/>
+          </w:rPr>
+          <w:t>https://www.ti.com/product/TPS7A20</w:t>
+        </w:r>
+      </w:hyperlink>
+      <w:r>
+        <w:t xml:space="preserve"> or thi</w:t>
+      </w:r>
+      <w:r>
+        <w:t>s??</w:t>
+      </w:r>
+    </w:p>
+    <w:p>
+      <w:pPr>
+        <w:pStyle w:val="ListParagraph"/>
+        <w:numPr>
+          <w:ilvl w:val="1"/>
+          <w:numId w:val="2"/>
+        </w:numPr>
+      </w:pPr>
+      <w:r>
+        <w:t xml:space="preserve">Header pins for external 5V input &amp; Ferrite </w:t>
+      </w:r>
+      <w:r>
+        <w:t>bead</w:t>
+      </w:r>
+    </w:p>
+    <w:p>
+      <w:pPr>
+        <w:pStyle w:val="ListParagraph"/>
+        <w:numPr>
+          <w:ilvl w:val="2"/>
+          <w:numId w:val="2"/>
+        </w:numPr>
+      </w:pPr>
+      <w:r>
+        <w:t>I am confused as to how the ferrite bead will block the inverter power input</w:t>
+      </w:r>
+    </w:p>
+    <w:p>
+      <w:pPr>
+        <w:pStyle w:val="ListParagraph"/>
+        <w:numPr>
+          <w:ilvl w:val="3"/>
+          <w:numId w:val="2"/>
+        </w:numPr>
+      </w:pPr>
+      <w:r>
+        <w:t>Have 2x2 pin header</w:t>
+      </w:r>
+    </w:p>
+    <w:p>
+      <w:pPr>
+        <w:pStyle w:val="ListParagraph"/>
+        <w:numPr>
+          <w:ilvl w:val="3"/>
+          <w:numId w:val="2"/>
+        </w:numPr>
+      </w:pPr>
+      <w:r>
+        <w:t>3x ferrite beads so if we don’t want one power level we can unsolder</w:t>
+      </w:r>
+    </w:p>
+    <w:p>
+      <w:pPr>
+        <w:pStyle w:val="ListParagraph"/>
+        <w:numPr>
+          <w:ilvl w:val="4"/>
+          <w:numId w:val="2"/>
+        </w:numPr>
+      </w:pPr>
+      <w:r>
+        <w:t>LED indicator for 3.3V rail so we know when it is turned on</w:t>
+      </w:r>
+    </w:p>
+    <w:p/>
     <w:p>
       <w:pPr>
         <w:pStyle w:val="ListParagraph"/>
         <w:numPr>
           <w:ilvl w:val="0"/>
-          <w:numId w:val="1"/>
-        </w:numPr>
-      </w:pPr>
-      <w:r>
-        <w:t xml:space="preserve">When I am simulating the Overcurrent Detection </w:t>
-      </w:r>
-      <w:proofErr w:type="spellStart"/>
-      <w:r>
-        <w:t>LTspice</w:t>
-      </w:r>
-      <w:proofErr w:type="spellEnd"/>
-      <w:r>
-        <w:t xml:space="preserve"> model, I do the transient analysis with 0.1 sec stop time but the simulation is very slow – like it doesn’t end. I tried with lower stop times but it is the same</w:t>
+          <w:numId w:val="2"/>
+        </w:numPr>
+      </w:pPr>
+      <w:r>
+        <w:t>Importing pcb board shape as dwg/dfx</w:t>
       </w:r>
     </w:p>
     <w:p>
@@ -100,11 +326,27 @@
         <w:pStyle w:val="ListParagraph"/>
         <w:numPr>
           <w:ilvl w:val="1"/>
-          <w:numId w:val="1"/>
-        </w:numPr>
-      </w:pPr>
-      <w:r>
-        <w:t>Oh if I go down to 1 nano second it is alright</w:t>
+          <w:numId w:val="2"/>
+        </w:numPr>
+      </w:pPr>
+      <w:r>
+        <w:t>Not working because the units don’t match up</w:t>
+      </w:r>
+    </w:p>
+    <w:p/>
+    <w:p>
+      <w:pPr>
+        <w:pStyle w:val="ListParagraph"/>
+        <w:numPr>
+          <w:ilvl w:val="0"/>
+          <w:numId w:val="2"/>
+        </w:numPr>
+      </w:pPr>
+      <w:r>
+        <w:rPr>
+          <w:highlight w:val="yellow"/>
+        </w:rPr>
+        <w:t>Just realized that different receiver models are being used is this okay?</w:t>
       </w:r>
     </w:p>
     <w:p>
@@ -112,11 +354,61 @@
         <w:pStyle w:val="ListParagraph"/>
         <w:numPr>
           <w:ilvl w:val="1"/>
-          <w:numId w:val="1"/>
-        </w:numPr>
-      </w:pPr>
-      <w:r>
-        <w:t>I think the step sizes are just different</w:t>
+          <w:numId w:val="2"/>
+        </w:numPr>
+        <w:rPr>
+          <w:b/>
+          <w:bCs/>
+        </w:rPr>
+      </w:pPr>
+      <w:r>
+        <w:t>HFBR-2528Z</w:t>
+      </w:r>
+      <w:r>
+        <w:t xml:space="preserve"> – receiver when on the website it states </w:t>
+      </w:r>
+      <w:r>
+        <w:rPr>
+          <w:b/>
+          <w:bCs/>
+        </w:rPr>
+        <w:t>Broadcom HFBR-2521Z</w:t>
+      </w:r>
+    </w:p>
+    <w:p>
+      <w:pPr>
+        <w:pStyle w:val="ListParagraph"/>
+        <w:numPr>
+          <w:ilvl w:val="1"/>
+          <w:numId w:val="2"/>
+        </w:numPr>
+        <w:rPr>
+          <w:b/>
+          <w:bCs/>
+        </w:rPr>
+      </w:pPr>
+      <w:r>
+        <w:t>Can look at the data sheet and get the difference</w:t>
+      </w:r>
+    </w:p>
+    <w:p>
+      <w:pPr>
+        <w:pStyle w:val="ListParagraph"/>
+      </w:pPr>
+    </w:p>
+    <w:p>
+      <w:pPr>
+        <w:rPr>
+          <w:b/>
+          <w:bCs/>
+        </w:rPr>
+      </w:pPr>
+      <w:r>
+        <w:rPr>
+          <w:b/>
+          <w:bCs/>
+        </w:rPr>
+        <w:t>Meeting Minutes:</w:t>
       </w:r>
     </w:p>
     <w:p>
@@ -124,16 +416,11 @@
         <w:pStyle w:val="ListParagraph"/>
         <w:numPr>
           <w:ilvl w:val="0"/>
-          <w:numId w:val="1"/>
-        </w:numPr>
-      </w:pPr>
-      <w:proofErr w:type="spellStart"/>
-      <w:r>
-        <w:t>LTspice</w:t>
-      </w:r>
-      <w:proofErr w:type="spellEnd"/>
-      <w:r>
-        <w:t xml:space="preserve"> to get current values</w:t>
+          <w:numId w:val="2"/>
+        </w:numPr>
+      </w:pPr>
+      <w:r>
+        <w:t>Bias voltage 1.7V</w:t>
       </w:r>
     </w:p>
     <w:p>
@@ -141,27 +428,36 @@
         <w:pStyle w:val="ListParagraph"/>
         <w:numPr>
           <w:ilvl w:val="1"/>
-          <w:numId w:val="1"/>
-        </w:numPr>
-      </w:pPr>
-      <w:r>
-        <w:t xml:space="preserve">If I add all the current values for VCC, VOCM and </w:t>
-      </w:r>
-      <w:proofErr w:type="spellStart"/>
-      <w:r>
-        <w:t>V_bias</w:t>
-      </w:r>
-      <w:proofErr w:type="spellEnd"/>
-      <w:r>
-        <w:t xml:space="preserve"> am I not theoretically adding the </w:t>
-      </w:r>
-      <w:proofErr w:type="spellStart"/>
-      <w:r>
-        <w:t>quidiscent</w:t>
-      </w:r>
-      <w:proofErr w:type="spellEnd"/>
-      <w:r>
-        <w:t xml:space="preserve"> current multiple times?</w:t>
+          <w:numId w:val="2"/>
+        </w:numPr>
+      </w:pPr>
+      <w:r>
+        <w:t>We can zero the offset and</w:t>
+      </w:r>
+    </w:p>
+    <w:p>
+      <w:pPr>
+        <w:pStyle w:val="ListParagraph"/>
+        <w:numPr>
+          <w:ilvl w:val="1"/>
+          <w:numId w:val="2"/>
+        </w:numPr>
+        <w:rPr>
+          <w:b/>
+          <w:bCs/>
+          <w:lang w:val="en-DE"/>
+        </w:rPr>
+      </w:pPr>
+      <w:r>
+        <w:t xml:space="preserve">Voltage reference </w:t>
+      </w:r>
+      <w:r>
+        <w:rPr>
+          <w:b/>
+          <w:bCs/>
+          <w:lang w:val="en-DE"/>
+        </w:rPr>
+        <w:t>REF35170</w:t>
       </w:r>
     </w:p>
     <w:p>
@@ -169,31 +465,94 @@
         <w:pStyle w:val="ListParagraph"/>
         <w:numPr>
           <w:ilvl w:val="2"/>
-          <w:numId w:val="1"/>
-        </w:numPr>
-      </w:pPr>
-      <w:r>
-        <w:t xml:space="preserve">I mean the current that VOCM pulls is lower than the </w:t>
-      </w:r>
-      <w:proofErr w:type="spellStart"/>
-      <w:r>
-        <w:t>quidiscent</w:t>
-      </w:r>
-      <w:proofErr w:type="spellEnd"/>
-      <w:r>
-        <w:t xml:space="preserve"> current</w:t>
-      </w:r>
-    </w:p>
-    <w:p>
+          <w:numId w:val="2"/>
+        </w:numPr>
+      </w:pPr>
+      <w:r>
+        <w:t>Look at current output we need</w:t>
+      </w:r>
+    </w:p>
+    <w:p>
+      <w:pPr>
+        <w:pStyle w:val="ListParagraph"/>
+        <w:numPr>
+          <w:ilvl w:val="3"/>
+          <w:numId w:val="2"/>
+        </w:numPr>
+      </w:pPr>
+      <w:r>
+        <w:lastRenderedPageBreak/>
+        <w:t>Can change feedback resistors on the diff op amp to vary current</w:t>
+      </w:r>
+    </w:p>
+    <w:p>
+      <w:pPr>
+        <w:pStyle w:val="ListParagraph"/>
+        <w:numPr>
+          <w:ilvl w:val="0"/>
+          <w:numId w:val="2"/>
+        </w:numPr>
+      </w:pPr>
+      <w:r>
+        <w:t>Bias votlage 2.5 VCOM – also use the same voltage reference REF35170</w:t>
+      </w:r>
+    </w:p>
+    <w:p>
+      <w:pPr>
+        <w:pStyle w:val="ListParagraph"/>
+        <w:numPr>
+          <w:ilvl w:val="0"/>
+          <w:numId w:val="2"/>
+        </w:numPr>
+      </w:pPr>
+      <w:r>
+        <w:t>Dual inverter</w:t>
+      </w:r>
+    </w:p>
+    <w:p>
+      <w:pPr>
+        <w:pStyle w:val="ListParagraph"/>
+        <w:numPr>
+          <w:ilvl w:val="1"/>
+          <w:numId w:val="2"/>
+        </w:numPr>
+      </w:pPr>
+      <w:r>
+        <w:t>Push pull output we do not need the 2k pullup resistor</w:t>
+      </w:r>
+      <w:r>
+        <w:t xml:space="preserve"> -&gt; legacy keep</w:t>
+      </w:r>
+    </w:p>
+    <w:p>
+      <w:pPr>
+        <w:pStyle w:val="ListParagraph"/>
+        <w:numPr>
+          <w:ilvl w:val="0"/>
+          <w:numId w:val="2"/>
+        </w:numPr>
+      </w:pPr>
+      <w:r>
+        <w:t>Transmitter</w:t>
+      </w:r>
+    </w:p>
+    <w:p>
+      <w:pPr>
+        <w:pStyle w:val="ListParagraph"/>
+        <w:numPr>
+          <w:ilvl w:val="1"/>
+          <w:numId w:val="2"/>
+        </w:numPr>
+      </w:pPr>
       <w:r>
         <w:rPr>
           <w:noProof/>
         </w:rPr>
         <w:drawing>
-          <wp:inline distT="0" distB="0" distL="0" distR="0" wp14:anchorId="3DEE5C8C" wp14:editId="21006BE7">
-            <wp:extent cx="4616450" cy="2292370"/>
-            <wp:effectExtent l="0" t="0" r="0" b="0"/>
-            <wp:docPr id="637990122" name="Picture 1" descr="A screenshot of a computer&#10;&#10;Description automatically generated"/>
+          <wp:inline distT="0" distB="0" distL="0" distR="0" wp14:anchorId="515C2FC5" wp14:editId="5FF52256">
+            <wp:extent cx="5731510" cy="6008370"/>
+            <wp:effectExtent l="0" t="0" r="2540" b="0"/>
+            <wp:docPr id="821705505" name="Picture 1" descr="A green line graph with numbers&#10;&#10;Description automatically generated"/>
             <wp:cNvGraphicFramePr>
               <a:graphicFrameLocks xmlns:a="http://schemas.openxmlformats.org/drawingml/2006/main" noChangeAspect="1"/>
             </wp:cNvGraphicFramePr>
@@ -201,11 +560,11 @@
               <a:graphicData uri="http://schemas.openxmlformats.org/drawingml/2006/picture">
                 <pic:pic xmlns:pic="http://schemas.openxmlformats.org/drawingml/2006/picture">
                   <pic:nvPicPr>
-                    <pic:cNvPr id="637990122" name="Picture 1" descr="A screenshot of a computer&#10;&#10;Description automatically generated"/>
+                    <pic:cNvPr id="821705505" name="Picture 1" descr="A green line graph with numbers&#10;&#10;Description automatically generated"/>
                     <pic:cNvPicPr/>
                   </pic:nvPicPr>
                   <pic:blipFill>
-                    <a:blip r:embed="rId5"/>
+                    <a:blip r:embed="rId8"/>
                     <a:stretch>
                       <a:fillRect/>
                     </a:stretch>
@@ -213,7 +572,7 @@
                   <pic:spPr>
                     <a:xfrm>
                       <a:off x="0" y="0"/>
-                      <a:ext cx="4623686" cy="2295963"/>
+                      <a:ext cx="5731510" cy="6008370"/>
                     </a:xfrm>
                     <a:prstGeom prst="rect">
                       <a:avLst/>
@@ -226,156 +585,97 @@
         </w:drawing>
       </w:r>
     </w:p>
-    <w:p/>
-    <w:p>
-      <w:r>
+    <w:p>
+      <w:pPr>
+        <w:pStyle w:val="ListParagraph"/>
+        <w:numPr>
+          <w:ilvl w:val="1"/>
+          <w:numId w:val="2"/>
+        </w:numPr>
+      </w:pPr>
+      <w:r>
+        <w:t xml:space="preserve">Do the calculations, and check by simulation – use a red LED for the transmitter </w:t>
+      </w:r>
+    </w:p>
+    <w:p>
+      <w:pPr>
+        <w:pStyle w:val="ListParagraph"/>
+        <w:numPr>
+          <w:ilvl w:val="1"/>
+          <w:numId w:val="2"/>
+        </w:numPr>
+      </w:pPr>
+    </w:p>
+    <w:p>
+      <w:pPr>
+        <w:pStyle w:val="ListParagraph"/>
+        <w:numPr>
+          <w:ilvl w:val="0"/>
+          <w:numId w:val="2"/>
+        </w:numPr>
+      </w:pPr>
+      <w:r>
+        <w:t>Gain of differential op amp should be from 3.3 -&gt; 5V (ADC card in Ultrazohm)</w:t>
+      </w:r>
+    </w:p>
+    <w:p>
+      <w:pPr>
+        <w:pStyle w:val="ListParagraph"/>
+        <w:numPr>
+          <w:ilvl w:val="1"/>
+          <w:numId w:val="2"/>
+        </w:numPr>
+      </w:pPr>
+      <w:bookmarkStart w:id="0" w:name="_Hlk188539267"/>
+      <w:r>
+        <w:t>Resistors of 10k and 6k68 -&gt; investigate</w:t>
+      </w:r>
+    </w:p>
+    <w:p>
+      <w:pPr>
+        <w:pStyle w:val="ListParagraph"/>
+        <w:numPr>
+          <w:ilvl w:val="1"/>
+          <w:numId w:val="2"/>
+        </w:numPr>
         <w:rPr>
           <w:highlight w:val="yellow"/>
         </w:rPr>
-        <w:t>Just realized that different receiver models are being used is this okay?</w:t>
-      </w:r>
-    </w:p>
-    <w:p>
-      <w:pPr>
+      </w:pPr>
+      <w:r>
         <w:rPr>
-          <w:b/>
-          <w:bCs/>
+          <w:highlight w:val="yellow"/>
         </w:rPr>
-      </w:pPr>
-      <w:r>
-        <w:t>HFBR-2528Z</w:t>
-      </w:r>
-      <w:r>
-        <w:t xml:space="preserve"> – receiver when on the website it states </w:t>
+        <w:t>This will change the current pull the whole op amp circuitry</w:t>
       </w:r>
       <w:r>
         <w:rPr>
-          <w:b/>
-          <w:bCs/>
+          <w:highlight w:val="yellow"/>
         </w:rPr>
-        <w:t>Broadcom HFBR-2521Z</w:t>
-      </w:r>
-    </w:p>
-    <w:p>
-      <w:pPr>
+        <w:t>!!!</w:t>
+      </w:r>
+      <w:r>
         <w:rPr>
-          <w:b/>
-          <w:bCs/>
+          <w:highlight w:val="yellow"/>
         </w:rPr>
-      </w:pPr>
-      <w:r>
-        <w:t>HFBR-1521Z</w:t>
-      </w:r>
-      <w:r>
-        <w:t xml:space="preserve"> – transmitter when on the website it states </w:t>
-      </w:r>
+        <w:t xml:space="preserve"> </w:t>
+      </w:r>
+    </w:p>
+    <w:bookmarkEnd w:id="0"/>
+    <w:p/>
+    <w:p/>
+    <w:p/>
+    <w:p/>
+    <w:p>
       <w:r>
         <w:rPr>
-          <w:b/>
-          <w:bCs/>
+          <w:noProof/>
         </w:rPr>
-        <w:t>Broadcom HFBR-1521Z</w:t>
-      </w:r>
-    </w:p>
-    <w:p>
-      <w:pPr>
-        <w:rPr>
-          <w:b/>
-          <w:bCs/>
-        </w:rPr>
-      </w:pPr>
-    </w:p>
-    <w:p>
-      <w:pPr>
-        <w:rPr>
-          <w:b/>
-          <w:bCs/>
-        </w:rPr>
-      </w:pPr>
-      <w:r>
-        <w:rPr>
-          <w:b/>
-          <w:bCs/>
-        </w:rPr>
-        <w:t>Transmitters and Receivers have multiple 3.3V inputs. How would I estimate the current pull of the ones directly attached to circuit?</w:t>
-      </w:r>
-    </w:p>
-    <w:p>
-      <w:pPr>
-        <w:rPr>
-          <w:b/>
-          <w:bCs/>
-        </w:rPr>
-      </w:pPr>
-    </w:p>
-    <w:p>
-      <w:pPr>
-        <w:rPr>
-          <w:b/>
-          <w:bCs/>
-        </w:rPr>
-      </w:pPr>
-    </w:p>
-    <w:p>
-      <w:pPr>
-        <w:pStyle w:val="ListParagraph"/>
-        <w:numPr>
-          <w:ilvl w:val="0"/>
-          <w:numId w:val="1"/>
-        </w:numPr>
-      </w:pPr>
-      <w:r>
-        <w:lastRenderedPageBreak/>
-        <w:t>Determining correct Bias voltage of circuit</w:t>
-      </w:r>
-    </w:p>
-    <w:p>
-      <w:pPr>
-        <w:pStyle w:val="ListParagraph"/>
-        <w:numPr>
-          <w:ilvl w:val="0"/>
-          <w:numId w:val="1"/>
-        </w:numPr>
-      </w:pPr>
-      <w:r>
-        <w:t>Differential Op Amp Feedback – especially when one end is connected to GND</w:t>
-      </w:r>
-    </w:p>
-    <w:p>
-      <w:pPr>
-        <w:pStyle w:val="ListParagraph"/>
-        <w:numPr>
-          <w:ilvl w:val="0"/>
-          <w:numId w:val="1"/>
-        </w:numPr>
-      </w:pPr>
-      <w:r>
-        <w:t>For 3.3V linear regulator there are 2 different models, which one should I use?</w:t>
-      </w:r>
-    </w:p>
-    <w:p>
-      <w:r>
         <w:drawing>
-          <wp:anchor distT="0" distB="0" distL="114300" distR="114300" simplePos="0" relativeHeight="251658240" behindDoc="1" locked="0" layoutInCell="1" allowOverlap="1" wp14:anchorId="749A6D60" wp14:editId="42ACD949">
-            <wp:simplePos x="0" y="0"/>
-            <wp:positionH relativeFrom="column">
-              <wp:posOffset>0</wp:posOffset>
-            </wp:positionH>
-            <wp:positionV relativeFrom="paragraph">
-              <wp:posOffset>635</wp:posOffset>
-            </wp:positionV>
-            <wp:extent cx="1263650" cy="704616"/>
-            <wp:effectExtent l="0" t="0" r="0" b="635"/>
-            <wp:wrapTight wrapText="bothSides">
-              <wp:wrapPolygon edited="0">
-                <wp:start x="0" y="0"/>
-                <wp:lineTo x="0" y="21035"/>
-                <wp:lineTo x="21166" y="21035"/>
-                <wp:lineTo x="21166" y="0"/>
-                <wp:lineTo x="0" y="0"/>
-              </wp:wrapPolygon>
-            </wp:wrapTight>
-            <wp:docPr id="1254805273" name="Picture 1" descr="A screenshot of a computer&#10;&#10;Description automatically generated"/>
+          <wp:inline distT="0" distB="0" distL="0" distR="0" wp14:anchorId="40FDCCBE" wp14:editId="3D85A261">
+            <wp:extent cx="5731510" cy="2917825"/>
+            <wp:effectExtent l="0" t="0" r="2540" b="0"/>
+            <wp:docPr id="658157439" name="Picture 1" descr="A white sheet with black and white text&#10;&#10;Description automatically generated"/>
             <wp:cNvGraphicFramePr>
               <a:graphicFrameLocks xmlns:a="http://schemas.openxmlformats.org/drawingml/2006/main" noChangeAspect="1"/>
             </wp:cNvGraphicFramePr>
@@ -383,17 +683,11 @@
               <a:graphicData uri="http://schemas.openxmlformats.org/drawingml/2006/picture">
                 <pic:pic xmlns:pic="http://schemas.openxmlformats.org/drawingml/2006/picture">
                   <pic:nvPicPr>
-                    <pic:cNvPr id="1254805273" name="Picture 1" descr="A screenshot of a computer&#10;&#10;Description automatically generated"/>
+                    <pic:cNvPr id="658157439" name="Picture 1" descr="A white sheet with black and white text&#10;&#10;Description automatically generated"/>
                     <pic:cNvPicPr/>
                   </pic:nvPicPr>
                   <pic:blipFill>
-                    <a:blip r:embed="rId6">
-                      <a:extLst>
-                        <a:ext uri="{28A0092B-C50C-407E-A947-70E740481C1C}">
-                          <a14:useLocalDpi xmlns:a14="http://schemas.microsoft.com/office/drawing/2010/main" val="0"/>
-                        </a:ext>
-                      </a:extLst>
-                    </a:blip>
+                    <a:blip r:embed="rId9"/>
                     <a:stretch>
                       <a:fillRect/>
                     </a:stretch>
@@ -401,7 +695,7 @@
                   <pic:spPr>
                     <a:xfrm>
                       <a:off x="0" y="0"/>
-                      <a:ext cx="1263650" cy="704616"/>
+                      <a:ext cx="5731510" cy="2917825"/>
                     </a:xfrm>
                     <a:prstGeom prst="rect">
                       <a:avLst/>
@@ -410,11 +704,108 @@
                 </pic:pic>
               </a:graphicData>
             </a:graphic>
-          </wp:anchor>
+          </wp:inline>
         </w:drawing>
       </w:r>
-      <w:r>
-        <w:t xml:space="preserve">Heat Sink </w:t>
+    </w:p>
+    <w:p>
+      <w:r>
+        <w:t>Dual inverter</w:t>
+      </w:r>
+    </w:p>
+    <w:p/>
+    <w:p/>
+    <w:p/>
+    <w:p>
+      <w:r>
+        <w:rPr>
+          <w:noProof/>
+        </w:rPr>
+        <w:drawing>
+          <wp:inline distT="0" distB="0" distL="0" distR="0" wp14:anchorId="6E787698" wp14:editId="31064AF8">
+            <wp:extent cx="5731510" cy="3014345"/>
+            <wp:effectExtent l="0" t="0" r="2540" b="0"/>
+            <wp:docPr id="546950376" name="Picture 1" descr="A diagram of a circuit&#10;&#10;Description automatically generated"/>
+            <wp:cNvGraphicFramePr>
+              <a:graphicFrameLocks xmlns:a="http://schemas.openxmlformats.org/drawingml/2006/main" noChangeAspect="1"/>
+            </wp:cNvGraphicFramePr>
+            <a:graphic xmlns:a="http://schemas.openxmlformats.org/drawingml/2006/main">
+              <a:graphicData uri="http://schemas.openxmlformats.org/drawingml/2006/picture">
+                <pic:pic xmlns:pic="http://schemas.openxmlformats.org/drawingml/2006/picture">
+                  <pic:nvPicPr>
+                    <pic:cNvPr id="546950376" name="Picture 1" descr="A diagram of a circuit&#10;&#10;Description automatically generated"/>
+                    <pic:cNvPicPr/>
+                  </pic:nvPicPr>
+                  <pic:blipFill>
+                    <a:blip r:embed="rId10"/>
+                    <a:stretch>
+                      <a:fillRect/>
+                    </a:stretch>
+                  </pic:blipFill>
+                  <pic:spPr>
+                    <a:xfrm>
+                      <a:off x="0" y="0"/>
+                      <a:ext cx="5731510" cy="3014345"/>
+                    </a:xfrm>
+                    <a:prstGeom prst="rect">
+                      <a:avLst/>
+                    </a:prstGeom>
+                  </pic:spPr>
+                </pic:pic>
+              </a:graphicData>
+            </a:graphic>
+          </wp:inline>
+        </w:drawing>
+      </w:r>
+    </w:p>
+    <w:p>
+      <w:r>
+        <w:rPr>
+          <w:highlight w:val="yellow"/>
+        </w:rPr>
+        <w:t>General Decoupling capacitors!</w:t>
+      </w:r>
+    </w:p>
+    <w:p>
+      <w:bookmarkStart w:id="1" w:name="_Hlk188539213"/>
+      <w:r>
+        <w:t>5V and GND 100nF decoupling capacitors</w:t>
+      </w:r>
+    </w:p>
+    <w:p>
+      <w:r>
+        <w:t>Also for the 1.7V bias 100nF</w:t>
+      </w:r>
+    </w:p>
+    <w:p>
+      <w:r>
+        <w:t>Also for overcurrent dectection – look at datasheet</w:t>
+      </w:r>
+    </w:p>
+    <w:bookmarkEnd w:id="1"/>
+    <w:p/>
+    <w:p/>
+    <w:p/>
+    <w:p/>
+    <w:p/>
+    <w:p/>
+    <w:p/>
+    <w:p/>
+    <w:p/>
+    <w:p/>
+    <w:p/>
+    <w:p/>
+    <w:p/>
+    <w:p/>
+    <w:p/>
+    <w:p/>
+    <w:p/>
+    <w:p/>
+    <w:p/>
+    <w:p/>
+    <w:p>
+      <w:r>
+        <w:t>Things to do:</w:t>
       </w:r>
     </w:p>
     <w:p>
@@ -425,6 +816,29 @@
           <w:numId w:val="1"/>
         </w:numPr>
       </w:pPr>
+      <w:r>
+        <w:t>Read about how bode plots are used in electrical engineering</w:t>
+      </w:r>
+    </w:p>
+    <w:p>
+      <w:pPr>
+        <w:pStyle w:val="ListParagraph"/>
+        <w:numPr>
+          <w:ilvl w:val="1"/>
+          <w:numId w:val="1"/>
+        </w:numPr>
+      </w:pPr>
+      <w:r>
+        <w:t>And signal processing</w:t>
+      </w:r>
+    </w:p>
+    <w:p/>
+    <w:p/>
+    <w:p/>
+    <w:p>
+      <w:r>
+        <w:t>Think about by myself:</w:t>
+      </w:r>
     </w:p>
     <w:p>
       <w:pPr>
@@ -434,111 +848,13 @@
           <w:numId w:val="1"/>
         </w:numPr>
       </w:pPr>
-    </w:p>
-    <w:p/>
-    <w:p/>
-    <w:p/>
-    <w:p/>
-    <w:p/>
-    <w:p>
-      <w:r>
-        <w:t>Things to do:</w:t>
-      </w:r>
-    </w:p>
-    <w:p>
-      <w:pPr>
-        <w:pStyle w:val="ListParagraph"/>
-        <w:numPr>
-          <w:ilvl w:val="0"/>
-          <w:numId w:val="1"/>
-        </w:numPr>
-      </w:pPr>
-      <w:r>
-        <w:t>Read about how bode plots are used in electrical engineering</w:t>
-      </w:r>
-    </w:p>
-    <w:p>
-      <w:pPr>
-        <w:pStyle w:val="ListParagraph"/>
-        <w:numPr>
-          <w:ilvl w:val="1"/>
-          <w:numId w:val="1"/>
-        </w:numPr>
-      </w:pPr>
-      <w:r>
-        <w:t>And signal processing</w:t>
-      </w:r>
-    </w:p>
-    <w:p/>
-    <w:p/>
-    <w:p>
-      <w:r>
-        <w:t>Components that pull current on Interface:</w:t>
-      </w:r>
-    </w:p>
-    <w:p>
-      <w:pPr>
-        <w:pStyle w:val="ListParagraph"/>
-        <w:numPr>
-          <w:ilvl w:val="0"/>
-          <w:numId w:val="1"/>
-        </w:numPr>
-      </w:pPr>
-      <w:r>
-        <w:t xml:space="preserve">2x </w:t>
-      </w:r>
-      <w:r>
-        <w:t>SN74HCS08DR</w:t>
-      </w:r>
-      <w:r>
-        <w:t xml:space="preserve"> AND Gate for Overcurrent Detection (3.3V)</w:t>
-      </w:r>
-    </w:p>
-    <w:p>
-      <w:pPr>
-        <w:pStyle w:val="ListParagraph"/>
-        <w:numPr>
-          <w:ilvl w:val="1"/>
-          <w:numId w:val="1"/>
-        </w:numPr>
-      </w:pPr>
-      <w:r>
-        <w:t xml:space="preserve">Can use </w:t>
-      </w:r>
-      <w:proofErr w:type="spellStart"/>
-      <w:r>
-        <w:t>LTspice</w:t>
-      </w:r>
-      <w:proofErr w:type="spellEnd"/>
-      <w:r>
-        <w:t xml:space="preserve"> models to estimate current pull</w:t>
-      </w:r>
-    </w:p>
-    <w:p>
-      <w:pPr>
-        <w:pStyle w:val="ListParagraph"/>
-        <w:numPr>
-          <w:ilvl w:val="1"/>
-          <w:numId w:val="1"/>
-        </w:numPr>
-      </w:pPr>
-      <w:r>
-        <w:t>For quiescent current consult the Datasheet</w:t>
-      </w:r>
-    </w:p>
-    <w:p>
-      <w:pPr>
-        <w:pStyle w:val="ListParagraph"/>
-        <w:numPr>
-          <w:ilvl w:val="0"/>
-          <w:numId w:val="1"/>
-        </w:numPr>
-      </w:pPr>
-      <w:r>
-        <w:t>3x Fully differential signals for Analog current measurement signals</w:t>
-      </w:r>
-    </w:p>
+      <w:r>
+        <w:t>Differential Op Amp Feedback – especially when one end is connected to GND</w:t>
+      </w:r>
+    </w:p>
+    <w:p/>
     <w:sectPr>
+      <w:footerReference w:type="default" r:id="rId11"/>
       <w:pgSz w:w="11906" w:h="16838"/>
       <w:pgMar w:top="1440" w:right="1440" w:bottom="1440" w:left="1440" w:header="708" w:footer="708" w:gutter="0"/>
       <w:cols w:space="708"/>
@@ -548,13 +864,78 @@
 </w:document>
 </file>
 
+<file path=word/endnotes.xml><?xml version="1.0" encoding="utf-8"?>
+<w:endnotes xmlns:wpc="http://schemas.microsoft.com/office/word/2010/wordprocessingCanvas" xmlns:cx="http://schemas.microsoft.com/office/drawing/2014/chartex" xmlns:cx1="http://schemas.microsoft.com/office/drawing/2015/9/8/chartex" xmlns:cx2="http://schemas.microsoft.com/office/drawing/2015/10/21/chartex" xmlns:cx3="http://schemas.microsoft.com/office/drawing/2016/5/9/chartex" xmlns:cx4="http://schemas.microsoft.com/office/drawing/2016/5/10/chartex" xmlns:cx5="http://schemas.microsoft.com/office/drawing/2016/5/11/chartex" xmlns:cx6="http://schemas.microsoft.com/office/drawing/2016/5/12/chartex" xmlns:cx7="http://schemas.microsoft.com/office/drawing/2016/5/13/chartex" xmlns:cx8="http://schemas.microsoft.com/office/drawing/2016/5/14/chartex" xmlns:mc="http://schemas.openxmlformats.org/markup-compatibility/2006" xmlns:aink="http://schemas.microsoft.com/office/drawing/2016/ink" xmlns:am3d="http://schemas.microsoft.com/office/drawing/2017/model3d" xmlns:o="urn:schemas-microsoft-com:office:office" xmlns:oel="http://schemas.microsoft.com/office/2019/extlst" xmlns:r="http://schemas.openxmlformats.org/officeDocument/2006/relationships" xmlns:m="http://schemas.openxmlformats.org/officeDocument/2006/math" xmlns:v="urn:schemas-microsoft-com:vml" xmlns:wp14="http://schemas.microsoft.com/office/word/2010/wordprocessingDrawing" xmlns:wp="http://schemas.openxmlformats.org/drawingml/2006/wordprocessingDrawing" xmlns:w10="urn:schemas-microsoft-com:office:word" xmlns:w="http://schemas.openxmlformats.org/wordprocessingml/2006/main" xmlns:w14="http://schemas.microsoft.com/office/word/2010/wordml" xmlns:w15="http://schemas.microsoft.com/office/word/2012/wordml" xmlns:w16cex="http://schemas.microsoft.com/office/word/2018/wordml/cex" xmlns:w16cid="http://schemas.microsoft.com/office/word/2016/wordml/cid" xmlns:w16="http://schemas.microsoft.com/office/word/2018/wordml" xmlns:w16du="http://schemas.microsoft.com/office/word/2023/wordml/word16du" xmlns:w16sdtdh="http://schemas.microsoft.com/office/word/2020/wordml/sdtdatahash" xmlns:w16sdtfl="http://schemas.microsoft.com/office/word/2024/wordml/sdtformatlock" xmlns:w16se="http://schemas.microsoft.com/office/word/2015/wordml/symex" xmlns:wpg="http://schemas.microsoft.com/office/word/2010/wordprocessingGroup" xmlns:wpi="http://schemas.microsoft.com/office/word/2010/wordprocessingInk" xmlns:wne="http://schemas.microsoft.com/office/word/2006/wordml" xmlns:wps="http://schemas.microsoft.com/office/word/2010/wordprocessingShape" mc:Ignorable="w14 w15 w16se w16cid w16 w16cex w16sdtdh w16sdtfl w16du wp14">
+  <w:endnote w:type="separator" w:id="-1">
+    <w:p>
+      <w:pPr>
+        <w:spacing w:after="0" w:line="240" w:lineRule="auto"/>
+      </w:pPr>
+      <w:r>
+        <w:separator/>
+      </w:r>
+    </w:p>
+  </w:endnote>
+  <w:endnote w:type="continuationSeparator" w:id="0">
+    <w:p>
+      <w:pPr>
+        <w:spacing w:after="0" w:line="240" w:lineRule="auto"/>
+      </w:pPr>
+      <w:r>
+        <w:continuationSeparator/>
+      </w:r>
+    </w:p>
+  </w:endnote>
+</w:endnotes>
+</file>
+
+<file path=word/footer1.xml><?xml version="1.0" encoding="utf-8"?>
+<w:ftr xmlns:wpc="http://schemas.microsoft.com/office/word/2010/wordprocessingCanvas" xmlns:cx="http://schemas.microsoft.com/office/drawing/2014/chartex" xmlns:cx1="http://schemas.microsoft.com/office/drawing/2015/9/8/chartex" xmlns:cx2="http://schemas.microsoft.com/office/drawing/2015/10/21/chartex" xmlns:cx3="http://schemas.microsoft.com/office/drawing/2016/5/9/chartex" xmlns:cx4="http://schemas.microsoft.com/office/drawing/2016/5/10/chartex" xmlns:cx5="http://schemas.microsoft.com/office/drawing/2016/5/11/chartex" xmlns:cx6="http://schemas.microsoft.com/office/drawing/2016/5/12/chartex" xmlns:cx7="http://schemas.microsoft.com/office/drawing/2016/5/13/chartex" xmlns:cx8="http://schemas.microsoft.com/office/drawing/2016/5/14/chartex" xmlns:mc="http://schemas.openxmlformats.org/markup-compatibility/2006" xmlns:aink="http://schemas.microsoft.com/office/drawing/2016/ink" xmlns:am3d="http://schemas.microsoft.com/office/drawing/2017/model3d" xmlns:o="urn:schemas-microsoft-com:office:office" xmlns:oel="http://schemas.microsoft.com/office/2019/extlst" xmlns:r="http://schemas.openxmlformats.org/officeDocument/2006/relationships" xmlns:m="http://schemas.openxmlformats.org/officeDocument/2006/math" xmlns:v="urn:schemas-microsoft-com:vml" xmlns:wp14="http://schemas.microsoft.com/office/word/2010/wordprocessingDrawing" xmlns:wp="http://schemas.openxmlformats.org/drawingml/2006/wordprocessingDrawing" xmlns:w10="urn:schemas-microsoft-com:office:word" xmlns:w="http://schemas.openxmlformats.org/wordprocessingml/2006/main" xmlns:w14="http://schemas.microsoft.com/office/word/2010/wordml" xmlns:w15="http://schemas.microsoft.com/office/word/2012/wordml" xmlns:w16cex="http://schemas.microsoft.com/office/word/2018/wordml/cex" xmlns:w16cid="http://schemas.microsoft.com/office/word/2016/wordml/cid" xmlns:w16="http://schemas.microsoft.com/office/word/2018/wordml" xmlns:w16du="http://schemas.microsoft.com/office/word/2023/wordml/word16du" xmlns:w16sdtdh="http://schemas.microsoft.com/office/word/2020/wordml/sdtdatahash" xmlns:w16sdtfl="http://schemas.microsoft.com/office/word/2024/wordml/sdtformatlock" xmlns:w16se="http://schemas.microsoft.com/office/word/2015/wordml/symex" xmlns:wpg="http://schemas.microsoft.com/office/word/2010/wordprocessingGroup" xmlns:wpi="http://schemas.microsoft.com/office/word/2010/wordprocessingInk" xmlns:wne="http://schemas.microsoft.com/office/word/2006/wordml" xmlns:wps="http://schemas.microsoft.com/office/word/2010/wordprocessingShape" mc:Ignorable="w14 w15 w16se w16cid w16 w16cex w16sdtdh w16sdtfl w16du wp14">
+  <w:p>
+    <w:pPr>
+      <w:pStyle w:val="Footer"/>
+    </w:pPr>
+  </w:p>
+  <w:p>
+    <w:pPr>
+      <w:pStyle w:val="Footer"/>
+    </w:pPr>
+  </w:p>
+</w:ftr>
+</file>
+
+<file path=word/footnotes.xml><?xml version="1.0" encoding="utf-8"?>
+<w:footnotes xmlns:wpc="http://schemas.microsoft.com/office/word/2010/wordprocessingCanvas" xmlns:cx="http://schemas.microsoft.com/office/drawing/2014/chartex" xmlns:cx1="http://schemas.microsoft.com/office/drawing/2015/9/8/chartex" xmlns:cx2="http://schemas.microsoft.com/office/drawing/2015/10/21/chartex" xmlns:cx3="http://schemas.microsoft.com/office/drawing/2016/5/9/chartex" xmlns:cx4="http://schemas.microsoft.com/office/drawing/2016/5/10/chartex" xmlns:cx5="http://schemas.microsoft.com/office/drawing/2016/5/11/chartex" xmlns:cx6="http://schemas.microsoft.com/office/drawing/2016/5/12/chartex" xmlns:cx7="http://schemas.microsoft.com/office/drawing/2016/5/13/chartex" xmlns:cx8="http://schemas.microsoft.com/office/drawing/2016/5/14/chartex" xmlns:mc="http://schemas.openxmlformats.org/markup-compatibility/2006" xmlns:aink="http://schemas.microsoft.com/office/drawing/2016/ink" xmlns:am3d="http://schemas.microsoft.com/office/drawing/2017/model3d" xmlns:o="urn:schemas-microsoft-com:office:office" xmlns:oel="http://schemas.microsoft.com/office/2019/extlst" xmlns:r="http://schemas.openxmlformats.org/officeDocument/2006/relationships" xmlns:m="http://schemas.openxmlformats.org/officeDocument/2006/math" xmlns:v="urn:schemas-microsoft-com:vml" xmlns:wp14="http://schemas.microsoft.com/office/word/2010/wordprocessingDrawing" xmlns:wp="http://schemas.openxmlformats.org/drawingml/2006/wordprocessingDrawing" xmlns:w10="urn:schemas-microsoft-com:office:word" xmlns:w="http://schemas.openxmlformats.org/wordprocessingml/2006/main" xmlns:w14="http://schemas.microsoft.com/office/word/2010/wordml" xmlns:w15="http://schemas.microsoft.com/office/word/2012/wordml" xmlns:w16cex="http://schemas.microsoft.com/office/word/2018/wordml/cex" xmlns:w16cid="http://schemas.microsoft.com/office/word/2016/wordml/cid" xmlns:w16="http://schemas.microsoft.com/office/word/2018/wordml" xmlns:w16du="http://schemas.microsoft.com/office/word/2023/wordml/word16du" xmlns:w16sdtdh="http://schemas.microsoft.com/office/word/2020/wordml/sdtdatahash" xmlns:w16sdtfl="http://schemas.microsoft.com/office/word/2024/wordml/sdtformatlock" xmlns:w16se="http://schemas.microsoft.com/office/word/2015/wordml/symex" xmlns:wpg="http://schemas.microsoft.com/office/word/2010/wordprocessingGroup" xmlns:wpi="http://schemas.microsoft.com/office/word/2010/wordprocessingInk" xmlns:wne="http://schemas.microsoft.com/office/word/2006/wordml" xmlns:wps="http://schemas.microsoft.com/office/word/2010/wordprocessingShape" mc:Ignorable="w14 w15 w16se w16cid w16 w16cex w16sdtdh w16sdtfl w16du wp14">
+  <w:footnote w:type="separator" w:id="-1">
+    <w:p>
+      <w:pPr>
+        <w:spacing w:after="0" w:line="240" w:lineRule="auto"/>
+      </w:pPr>
+      <w:r>
+        <w:separator/>
+      </w:r>
+    </w:p>
+  </w:footnote>
+  <w:footnote w:type="continuationSeparator" w:id="0">
+    <w:p>
+      <w:pPr>
+        <w:spacing w:after="0" w:line="240" w:lineRule="auto"/>
+      </w:pPr>
+      <w:r>
+        <w:continuationSeparator/>
+      </w:r>
+    </w:p>
+  </w:footnote>
+</w:footnotes>
+</file>
+
 <file path=word/numbering.xml><?xml version="1.0" encoding="utf-8"?>
 <w:numbering xmlns:wpc="http://schemas.microsoft.com/office/word/2010/wordprocessingCanvas" xmlns:cx="http://schemas.microsoft.com/office/drawing/2014/chartex" xmlns:cx1="http://schemas.microsoft.com/office/drawing/2015/9/8/chartex" xmlns:cx2="http://schemas.microsoft.com/office/drawing/2015/10/21/chartex" xmlns:cx3="http://schemas.microsoft.com/office/drawing/2016/5/9/chartex" xmlns:cx4="http://schemas.microsoft.com/office/drawing/2016/5/10/chartex" xmlns:cx5="http://schemas.microsoft.com/office/drawing/2016/5/11/chartex" xmlns:cx6="http://schemas.microsoft.com/office/drawing/2016/5/12/chartex" xmlns:cx7="http://schemas.microsoft.com/office/drawing/2016/5/13/chartex" xmlns:cx8="http://schemas.microsoft.com/office/drawing/2016/5/14/chartex" xmlns:mc="http://schemas.openxmlformats.org/markup-compatibility/2006" xmlns:aink="http://schemas.microsoft.com/office/drawing/2016/ink" xmlns:am3d="http://schemas.microsoft.com/office/drawing/2017/model3d" xmlns:o="urn:schemas-microsoft-com:office:office" xmlns:oel="http://schemas.microsoft.com/office/2019/extlst" xmlns:r="http://schemas.openxmlformats.org/officeDocument/2006/relationships" xmlns:m="http://schemas.openxmlformats.org/officeDocument/2006/math" xmlns:v="urn:schemas-microsoft-com:vml" xmlns:wp14="http://schemas.microsoft.com/office/word/2010/wordprocessingDrawing" xmlns:wp="http://schemas.openxmlformats.org/drawingml/2006/wordprocessingDrawing" xmlns:w10="urn:schemas-microsoft-com:office:word" xmlns:w="http://schemas.openxmlformats.org/wordprocessingml/2006/main" xmlns:w14="http://schemas.microsoft.com/office/word/2010/wordml" xmlns:w15="http://schemas.microsoft.com/office/word/2012/wordml" xmlns:w16cex="http://schemas.microsoft.com/office/word/2018/wordml/cex" xmlns:w16cid="http://schemas.microsoft.com/office/word/2016/wordml/cid" xmlns:w16="http://schemas.microsoft.com/office/word/2018/wordml" xmlns:w16du="http://schemas.microsoft.com/office/word/2023/wordml/word16du" xmlns:w16sdtdh="http://schemas.microsoft.com/office/word/2020/wordml/sdtdatahash" xmlns:w16sdtfl="http://schemas.microsoft.com/office/word/2024/wordml/sdtformatlock" xmlns:w16se="http://schemas.microsoft.com/office/word/2015/wordml/symex" xmlns:wpg="http://schemas.microsoft.com/office/word/2010/wordprocessingGroup" xmlns:wpi="http://schemas.microsoft.com/office/word/2010/wordprocessingInk" xmlns:wne="http://schemas.microsoft.com/office/word/2006/wordml" xmlns:wps="http://schemas.microsoft.com/office/word/2010/wordprocessingShape" mc:Ignorable="w14 w15 w16se w16cid w16 w16cex w16sdtdh w16sdtfl w16du wp14">
   <w:abstractNum w:abstractNumId="0" w15:restartNumberingAfterBreak="0">
-    <w:nsid w:val="4BEE3677"/>
+    <w:nsid w:val="022C13F7"/>
     <w:multiLevelType w:val="hybridMultilevel"/>
-    <w:tmpl w:val="0C52287C"/>
-    <w:lvl w:ilvl="0" w:tplc="B95455E8">
+    <w:tmpl w:val="8E54A0DA"/>
+    <w:lvl w:ilvl="0" w:tplc="72583452">
       <w:numFmt w:val="bullet"/>
       <w:lvlText w:val="-"/>
       <w:lvlJc w:val="left"/>
@@ -589,6 +970,118 @@
         <w:rFonts w:ascii="Wingdings" w:hAnsi="Wingdings" w:hint="default"/>
       </w:rPr>
     </w:lvl>
+    <w:lvl w:ilvl="3" w:tplc="20000001">
+      <w:start w:val="1"/>
+      <w:numFmt w:val="bullet"/>
+      <w:lvlText w:val=""/>
+      <w:lvlJc w:val="left"/>
+      <w:pPr>
+        <w:ind w:left="2880" w:hanging="360"/>
+      </w:pPr>
+      <w:rPr>
+        <w:rFonts w:ascii="Symbol" w:hAnsi="Symbol" w:hint="default"/>
+      </w:rPr>
+    </w:lvl>
+    <w:lvl w:ilvl="4" w:tplc="20000003">
+      <w:start w:val="1"/>
+      <w:numFmt w:val="bullet"/>
+      <w:lvlText w:val="o"/>
+      <w:lvlJc w:val="left"/>
+      <w:pPr>
+        <w:ind w:left="3600" w:hanging="360"/>
+      </w:pPr>
+      <w:rPr>
+        <w:rFonts w:ascii="Courier New" w:hAnsi="Courier New" w:cs="Courier New" w:hint="default"/>
+      </w:rPr>
+    </w:lvl>
+    <w:lvl w:ilvl="5" w:tplc="20000005" w:tentative="1">
+      <w:start w:val="1"/>
+      <w:numFmt w:val="bullet"/>
+      <w:lvlText w:val=""/>
+      <w:lvlJc w:val="left"/>
+      <w:pPr>
+        <w:ind w:left="4320" w:hanging="360"/>
+      </w:pPr>
+      <w:rPr>
+        <w:rFonts w:ascii="Wingdings" w:hAnsi="Wingdings" w:hint="default"/>
+      </w:rPr>
+    </w:lvl>
+    <w:lvl w:ilvl="6" w:tplc="20000001" w:tentative="1">
+      <w:start w:val="1"/>
+      <w:numFmt w:val="bullet"/>
+      <w:lvlText w:val=""/>
+      <w:lvlJc w:val="left"/>
+      <w:pPr>
+        <w:ind w:left="5040" w:hanging="360"/>
+      </w:pPr>
+      <w:rPr>
+        <w:rFonts w:ascii="Symbol" w:hAnsi="Symbol" w:hint="default"/>
+      </w:rPr>
+    </w:lvl>
+    <w:lvl w:ilvl="7" w:tplc="20000003" w:tentative="1">
+      <w:start w:val="1"/>
+      <w:numFmt w:val="bullet"/>
+      <w:lvlText w:val="o"/>
+      <w:lvlJc w:val="left"/>
+      <w:pPr>
+        <w:ind w:left="5760" w:hanging="360"/>
+      </w:pPr>
+      <w:rPr>
+        <w:rFonts w:ascii="Courier New" w:hAnsi="Courier New" w:cs="Courier New" w:hint="default"/>
+      </w:rPr>
+    </w:lvl>
+    <w:lvl w:ilvl="8" w:tplc="20000005" w:tentative="1">
+      <w:start w:val="1"/>
+      <w:numFmt w:val="bullet"/>
+      <w:lvlText w:val=""/>
+      <w:lvlJc w:val="left"/>
+      <w:pPr>
+        <w:ind w:left="6480" w:hanging="360"/>
+      </w:pPr>
+      <w:rPr>
+        <w:rFonts w:ascii="Wingdings" w:hAnsi="Wingdings" w:hint="default"/>
+      </w:rPr>
+    </w:lvl>
+  </w:abstractNum>
+  <w:abstractNum w:abstractNumId="1" w15:restartNumberingAfterBreak="0">
+    <w:nsid w:val="4BEE3677"/>
+    <w:multiLevelType w:val="hybridMultilevel"/>
+    <w:tmpl w:val="0C52287C"/>
+    <w:lvl w:ilvl="0" w:tplc="B95455E8">
+      <w:numFmt w:val="bullet"/>
+      <w:lvlText w:val="-"/>
+      <w:lvlJc w:val="left"/>
+      <w:pPr>
+        <w:ind w:left="720" w:hanging="360"/>
+      </w:pPr>
+      <w:rPr>
+        <w:rFonts w:ascii="Aptos" w:eastAsiaTheme="minorEastAsia" w:hAnsi="Aptos" w:cstheme="minorBidi" w:hint="default"/>
+      </w:rPr>
+    </w:lvl>
+    <w:lvl w:ilvl="1" w:tplc="20000003">
+      <w:start w:val="1"/>
+      <w:numFmt w:val="bullet"/>
+      <w:lvlText w:val="o"/>
+      <w:lvlJc w:val="left"/>
+      <w:pPr>
+        <w:ind w:left="1440" w:hanging="360"/>
+      </w:pPr>
+      <w:rPr>
+        <w:rFonts w:ascii="Courier New" w:hAnsi="Courier New" w:cs="Courier New" w:hint="default"/>
+      </w:rPr>
+    </w:lvl>
+    <w:lvl w:ilvl="2" w:tplc="20000005">
+      <w:start w:val="1"/>
+      <w:numFmt w:val="bullet"/>
+      <w:lvlText w:val=""/>
+      <w:lvlJc w:val="left"/>
+      <w:pPr>
+        <w:ind w:left="2160" w:hanging="360"/>
+      </w:pPr>
+      <w:rPr>
+        <w:rFonts w:ascii="Wingdings" w:hAnsi="Wingdings" w:hint="default"/>
+      </w:rPr>
+    </w:lvl>
     <w:lvl w:ilvl="3" w:tplc="20000001" w:tentative="1">
       <w:start w:val="1"/>
       <w:numFmt w:val="bullet"/>
@@ -663,6 +1156,9 @@
     </w:lvl>
   </w:abstractNum>
   <w:num w:numId="1" w16cid:durableId="1384135225">
+    <w:abstractNumId w:val="1"/>
+  </w:num>
+  <w:num w:numId="2" w16cid:durableId="861557386">
     <w:abstractNumId w:val="0"/>
   </w:num>
 </w:numbering>
@@ -1599,6 +2095,91 @@
       <w:spacing w:val="5"/>
     </w:rPr>
   </w:style>
+  <w:style w:type="character" w:styleId="Hyperlink">
+    <w:name w:val="Hyperlink"/>
+    <w:basedOn w:val="DefaultParagraphFont"/>
+    <w:uiPriority w:val="99"/>
+    <w:unhideWhenUsed/>
+    <w:rsid w:val="00977053"/>
+    <w:rPr>
+      <w:color w:val="467886" w:themeColor="hyperlink"/>
+      <w:u w:val="single"/>
+    </w:rPr>
+  </w:style>
+  <w:style w:type="character" w:styleId="UnresolvedMention">
+    <w:name w:val="Unresolved Mention"/>
+    <w:basedOn w:val="DefaultParagraphFont"/>
+    <w:uiPriority w:val="99"/>
+    <w:semiHidden/>
+    <w:unhideWhenUsed/>
+    <w:rsid w:val="00977053"/>
+    <w:rPr>
+      <w:color w:val="605E5C"/>
+      <w:shd w:val="clear" w:color="auto" w:fill="E1DFDD"/>
+    </w:rPr>
+  </w:style>
+  <w:style w:type="character" w:styleId="FollowedHyperlink">
+    <w:name w:val="FollowedHyperlink"/>
+    <w:basedOn w:val="DefaultParagraphFont"/>
+    <w:uiPriority w:val="99"/>
+    <w:semiHidden/>
+    <w:unhideWhenUsed/>
+    <w:rsid w:val="007D11C2"/>
+    <w:rPr>
+      <w:color w:val="96607D" w:themeColor="followedHyperlink"/>
+      <w:u w:val="single"/>
+    </w:rPr>
+  </w:style>
+  <w:style w:type="paragraph" w:styleId="Header">
+    <w:name w:val="header"/>
+    <w:basedOn w:val="Normal"/>
+    <w:link w:val="HeaderChar"/>
+    <w:uiPriority w:val="99"/>
+    <w:unhideWhenUsed/>
+    <w:rsid w:val="007F6E60"/>
+    <w:pPr>
+      <w:tabs>
+        <w:tab w:val="center" w:pos="4513"/>
+        <w:tab w:val="right" w:pos="9026"/>
+      </w:tabs>
+      <w:spacing w:after="0" w:line="240" w:lineRule="auto"/>
+    </w:pPr>
+  </w:style>
+  <w:style w:type="character" w:customStyle="1" w:styleId="HeaderChar">
+    <w:name w:val="Header Char"/>
+    <w:basedOn w:val="DefaultParagraphFont"/>
+    <w:link w:val="Header"/>
+    <w:uiPriority w:val="99"/>
+    <w:rsid w:val="007F6E60"/>
+    <w:rPr>
+      <w:lang w:val="en-US"/>
+    </w:rPr>
+  </w:style>
+  <w:style w:type="paragraph" w:styleId="Footer">
+    <w:name w:val="footer"/>
+    <w:basedOn w:val="Normal"/>
+    <w:link w:val="FooterChar"/>
+    <w:uiPriority w:val="99"/>
+    <w:unhideWhenUsed/>
+    <w:rsid w:val="007F6E60"/>
+    <w:pPr>
+      <w:tabs>
+        <w:tab w:val="center" w:pos="4513"/>
+        <w:tab w:val="right" w:pos="9026"/>
+      </w:tabs>
+      <w:spacing w:after="0" w:line="240" w:lineRule="auto"/>
+    </w:pPr>
+  </w:style>
+  <w:style w:type="character" w:customStyle="1" w:styleId="FooterChar">
+    <w:name w:val="Footer Char"/>
+    <w:basedOn w:val="DefaultParagraphFont"/>
+    <w:link w:val="Footer"/>
+    <w:uiPriority w:val="99"/>
+    <w:rsid w:val="007F6E60"/>
+    <w:rPr>
+      <w:lang w:val="en-US"/>
+    </w:rPr>
+  </w:style>
 </w:styles>
 </file>
 

</xml_diff>